<commit_message>
feat: add the Insighture logo to the guidelines, templates and package
- brand/logo/: the supplied black and white logos, plus derived white-mono
  (for rose grounds, where the rose dot disappears) and black-mono (for
  single-colour print) versions.
- GUIDELINES.md: a Logo section with a usage sheet, versions per ground,
  clear space, minimum size and misuse rules.
- Every template now uses the real logo instead of a typed wordmark:
  PowerPoint layouts and footers, Word cover/headers/letterhead, PDF covers
  and running headers, email header and social cards.
- The logo SVGs ship with the package (`@insighture/design-system/logo/*`).

Co-Authored-By: Claude Opus 5.5 <noreply@anthropic.com>
</commit_message>
<xml_diff>
--- a/templates/word/Insighture-report-sample.docx
+++ b/templates/word/Insighture-report-sample.docx
@@ -57,12 +57,44 @@
         <w:spacing w:after="4800"/>
       </w:pPr>
       <w:r>
-        <w:rPr>
-          <w:color w:val="FFFFFF"/>
-          <w:sz w:val="40"/>
-          <w:szCs w:val="40"/>
-        </w:rPr>
-        <w:t xml:space="preserve">Insighture</w:t>
+        <w:drawing>
+          <wp:inline distT="0" distB="0" distL="0" distR="0">
+            <wp:extent cx="1428750" cy="333375"/>
+            <wp:effectExtent t="0" r="0" b="0" l="0"/>
+            <wp:docPr id="1" name="Insighture" descr="Insighture logo" title="Insighture"/>
+            <wp:cNvGraphicFramePr>
+              <a:graphicFrameLocks xmlns:a="http://schemas.openxmlformats.org/drawingml/2006/main" noChangeAspect="1"/>
+            </wp:cNvGraphicFramePr>
+            <a:graphic xmlns:a="http://schemas.openxmlformats.org/drawingml/2006/main">
+              <a:graphicData uri="http://schemas.openxmlformats.org/drawingml/2006/picture">
+                <pic:pic xmlns:pic="http://schemas.openxmlformats.org/drawingml/2006/picture">
+                  <pic:nvPicPr>
+                    <pic:cNvPr id="0" name="" descr=""/>
+                    <pic:cNvPicPr>
+                      <a:picLocks noChangeAspect="1" noChangeArrowheads="1"/>
+                    </pic:cNvPicPr>
+                  </pic:nvPicPr>
+                  <pic:blipFill>
+                    <a:blip r:embed="rId9" cstate="none"/>
+                    <a:srcRect/>
+                    <a:stretch>
+                      <a:fillRect/>
+                    </a:stretch>
+                  </pic:blipFill>
+                  <pic:spPr bwMode="auto">
+                    <a:xfrm>
+                      <a:off x="0" y="0"/>
+                      <a:ext cx="1428750" cy="333375"/>
+                    </a:xfrm>
+                    <a:prstGeom prst="rect">
+                      <a:avLst/>
+                    </a:prstGeom>
+                  </pic:spPr>
+                </pic:pic>
+              </a:graphicData>
+            </a:graphic>
+          </wp:inline>
+        </w:drawing>
       </w:r>
     </w:p>
     <w:p>
@@ -1525,14 +1557,44 @@
       </w:tabs>
     </w:pPr>
     <w:r>
-      <w:rPr>
-        <w:b/>
-        <w:bCs/>
-        <w:color w:val="15181A"/>
-        <w:sz w:val="18"/>
-        <w:szCs w:val="18"/>
-      </w:rPr>
-      <w:t xml:space="preserve">Insighture</w:t>
+      <w:drawing>
+        <wp:inline distT="0" distB="0" distL="0" distR="0">
+          <wp:extent cx="666750" cy="161925"/>
+          <wp:effectExtent t="0" r="0" b="0" l="0"/>
+          <wp:docPr id="1" name="Insighture" descr="Insighture logo" title="Insighture"/>
+          <wp:cNvGraphicFramePr>
+            <a:graphicFrameLocks xmlns:a="http://schemas.openxmlformats.org/drawingml/2006/main" noChangeAspect="1"/>
+          </wp:cNvGraphicFramePr>
+          <a:graphic xmlns:a="http://schemas.openxmlformats.org/drawingml/2006/main">
+            <a:graphicData uri="http://schemas.openxmlformats.org/drawingml/2006/picture">
+              <pic:pic xmlns:pic="http://schemas.openxmlformats.org/drawingml/2006/picture">
+                <pic:nvPicPr>
+                  <pic:cNvPr id="0" name="" descr=""/>
+                  <pic:cNvPicPr>
+                    <a:picLocks noChangeAspect="1" noChangeArrowheads="1"/>
+                  </pic:cNvPicPr>
+                </pic:nvPicPr>
+                <pic:blipFill>
+                  <a:blip r:embed="rId0" cstate="none"/>
+                  <a:srcRect/>
+                  <a:stretch>
+                    <a:fillRect/>
+                  </a:stretch>
+                </pic:blipFill>
+                <pic:spPr bwMode="auto">
+                  <a:xfrm>
+                    <a:off x="0" y="0"/>
+                    <a:ext cx="666750" cy="161925"/>
+                  </a:xfrm>
+                  <a:prstGeom prst="rect">
+                    <a:avLst/>
+                  </a:prstGeom>
+                </pic:spPr>
+              </pic:pic>
+            </a:graphicData>
+          </a:graphic>
+        </wp:inline>
+      </w:drawing>
     </w:r>
     <w:r>
       <w:rPr>

</xml_diff>

<commit_message>
feat: brand kit for AI assistants, with a brand checker
skills/insighture-design-system/ packages the brand for any AI tool:
SKILL.md for Claude and other Agent Skills readers, a generated AGENTS.md
for Codex, Cursor, Copilot, Gemini and custom GPTs/Gems, the logo, the
Office and email templates, and the tokens. `npm run skill` rebuilds it
and zips it to dist/ for upload.

scripts/check_brand.py (Python 3, no dependencies) checks .pptx, .docx,
.xlsx, .html, .css, .svg and .pdf files for off-palette colours, non-brand
fonts, a missing logo and overuse of rose, and exits non-zero on errors.

Running it over the templates found Office defaults leaking through, now
fixed in the generators: the chart's hidden value axis kept pptxgenjs'
grey/black/Arial, Word's Heading 4-6 and Hyperlink styles were Office
blue, and the card-grid slide had a second rose element.

Co-Authored-By: Claude Opus 5.5 <noreply@anthropic.com>
</commit_message>
<xml_diff>
--- a/templates/word/Insighture-report-sample.docx
+++ b/templates/word/Insighture-report-sample.docx
@@ -1840,10 +1840,17 @@
     <w:basedOn w:val="Normal"/>
     <w:next w:val="Normal"/>
     <w:qFormat/>
+    <w:pPr>
+      <w:keepNext/>
+      <w:spacing w:before="160" w:after="60"/>
+    </w:pPr>
     <w:rPr>
-      <w:i/>
-      <w:iCs/>
-      <w:color w:val="2E74B5"/>
+      <w:rFonts w:ascii="DM Sans" w:cs="DM Sans" w:eastAsia="DM Sans" w:hAnsi="DM Sans"/>
+      <w:b/>
+      <w:bCs/>
+      <w:color w:val="15181A"/>
+      <w:sz w:val="21"/>
+      <w:szCs w:val="21"/>
     </w:rPr>
   </w:style>
   <w:style w:type="paragraph" w:styleId="Heading5">
@@ -1851,8 +1858,17 @@
     <w:basedOn w:val="Normal"/>
     <w:next w:val="Normal"/>
     <w:qFormat/>
+    <w:pPr>
+      <w:keepNext/>
+      <w:spacing w:before="160" w:after="60"/>
+    </w:pPr>
     <w:rPr>
-      <w:color w:val="2E74B5"/>
+      <w:rFonts w:ascii="DM Sans" w:cs="DM Sans" w:eastAsia="DM Sans" w:hAnsi="DM Sans"/>
+      <w:b/>
+      <w:bCs/>
+      <w:color w:val="3E4449"/>
+      <w:sz w:val="21"/>
+      <w:szCs w:val="21"/>
     </w:rPr>
   </w:style>
   <w:style w:type="paragraph" w:styleId="Heading6">
@@ -1860,8 +1876,18 @@
     <w:basedOn w:val="Normal"/>
     <w:next w:val="Normal"/>
     <w:qFormat/>
+    <w:pPr>
+      <w:keepNext/>
+      <w:spacing w:before="160" w:after="60"/>
+    </w:pPr>
     <w:rPr>
-      <w:color w:val="1F4D78"/>
+      <w:rFonts w:ascii="DM Sans" w:cs="DM Sans" w:eastAsia="DM Sans" w:hAnsi="DM Sans"/>
+      <w:b/>
+      <w:bCs/>
+      <w:caps/>
+      <w:color w:val="6B7278"/>
+      <w:sz w:val="18"/>
+      <w:szCs w:val="18"/>
     </w:rPr>
   </w:style>
   <w:style w:type="paragraph" w:styleId="Strong">
@@ -1885,8 +1911,8 @@
     <w:uiPriority w:val="99"/>
     <w:unhideWhenUsed/>
     <w:rPr>
-      <w:color w:val="0563C1"/>
-      <w:u w:val="single"/>
+      <w:color w:val="15181A"/>
+      <w:u w:val="single" w:color="15181A"/>
     </w:rPr>
   </w:style>
   <w:style w:type="character" w:styleId="FootnoteReference">

</xml_diff>